<commit_message>
Add FM5 exemption creep to allied memo; rewrite Iran/Helium/Ag brief
Allied memo: Failure Mode 5 (structural exemption/exemption creep) and
Safeguard 5 (statutory prohibition on instrument-specific exemptions) added.
Action 4 escrow contradiction resolved — social programs from day one.

Iran/Helium/Ag brief: full rewrite as dollar_stability_brief_2026-04-05.docx.
Staffer-readable cover page (one-pager, two-column). Helium and fertilizer
given dedicated sections with tables. 5-year/50-year consequence timeline
added (Section VII). Conservative register throughout.

Co-Authored-By: Claude Sonnet 4.6 <noreply@anthropic.com>
</commit_message>
<xml_diff>
--- a/reports/allied_memo_2026-04-05.docx
+++ b/reports/allied_memo_2026-04-05.docx
@@ -715,57 +715,6 @@
     </w:tbl>
     <w:p>
       <w:pPr>
-        <w:spacing w:after="0" w:before="200"/>
-      </w:pPr>
-      <w:r>
-        <w:t xml:space="preserve"/>
-      </w:r>
-    </w:p>
-    <w:p>
-      <w:r>
-        <w:br w:type="page"/>
-      </w:r>
-    </w:p>
-    <w:p>
-      <w:pPr>
-        <w:pStyle w:val="Heading1"/>
-        <w:pBdr>
-          <w:bottom w:val="single" w:color="B8860B" w:sz="4"/>
-        </w:pBdr>
-        <w:spacing w:after="100" w:before="320"/>
-      </w:pPr>
-      <w:r>
-        <w:rPr>
-          <w:rFonts w:ascii="Arial" w:cs="Arial" w:eastAsia="Arial" w:hAnsi="Arial"/>
-          <w:b/>
-          <w:bCs/>
-          <w:color w:val="1B3A5C"/>
-          <w:sz w:val="28"/>
-          <w:szCs w:val="28"/>
-        </w:rPr>
-        <w:t xml:space="preserve">III. The Non-Negotiable Statutory Package</w:t>
-      </w:r>
-    </w:p>
-    <w:p>
-      <w:pPr>
-        <w:spacing w:after="100" w:before="60"/>
-      </w:pPr>
-      <w:r>
-        <w:rPr>
-          <w:rFonts w:ascii="Arial" w:cs="Arial" w:eastAsia="Arial" w:hAnsi="Arial"/>
-          <w:b w:val="false"/>
-          <w:bCs w:val="false"/>
-          <w:i w:val="false"/>
-          <w:iCs w:val="false"/>
-          <w:color w:val="1A1A1A"/>
-          <w:sz w:val="22"/>
-          <w:szCs w:val="22"/>
-        </w:rPr>
-        <w:t xml:space="preserve">The following provisions must survive conference intact. Each corresponds to a specific failure mode. Losing any one of them converts the proposal from transformative to harmful.</w:t>
-      </w:r>
-    </w:p>
-    <w:p>
-      <w:pPr>
         <w:spacing w:after="0" w:before="120"/>
       </w:pPr>
       <w:r>
@@ -792,12 +741,12 @@
           <w:tcPr>
             <w:tcW w:type="dxa" w:w="9720"/>
             <w:tcBorders>
-              <w:top w:val="single" w:color="2E6B2E" w:sz="6"/>
-              <w:left w:val="single" w:color="2E6B2E" w:sz="6"/>
-              <w:bottom w:val="single" w:color="2E6B2E" w:sz="6"/>
-              <w:right w:val="single" w:color="2E6B2E" w:sz="6"/>
-            </w:tcBorders>
-            <w:shd w:fill="2E6B2E" w:val="clear"/>
+              <w:top w:val="single" w:color="8B1A1A" w:sz="6"/>
+              <w:left w:val="single" w:color="8B1A1A" w:sz="6"/>
+              <w:bottom w:val="single" w:color="8B1A1A" w:sz="6"/>
+              <w:right w:val="single" w:color="8B1A1A" w:sz="6"/>
+            </w:tcBorders>
+            <w:shd w:fill="8B1A1A" w:val="clear"/>
             <w:tcMar>
               <w:top w:type="dxa" w:w="60"/>
               <w:left w:type="dxa" w:w="160"/>
@@ -815,7 +764,7 @@
                 <w:sz w:val="20"/>
                 <w:szCs w:val="20"/>
               </w:rPr>
-              <w:t xml:space="preserve">SAFEGUARD 1: STATUTORY ALLOCATION LOCK (VS. FAILURE MODE 2)</w:t>
+              <w:t xml:space="preserve">FAILURE MODE 5: STRUCTURAL EXEMPTION (EXEMPTION CREEP)</w:t>
             </w:r>
           </w:p>
         </w:tc>
@@ -825,12 +774,12 @@
           <w:tcPr>
             <w:tcW w:type="dxa" w:w="9720"/>
             <w:tcBorders>
-              <w:top w:val="single" w:color="2E6B2E" w:sz="6"/>
-              <w:left w:val="single" w:color="2E6B2E" w:sz="6"/>
-              <w:bottom w:val="single" w:color="2E6B2E" w:sz="6"/>
-              <w:right w:val="single" w:color="2E6B2E" w:sz="6"/>
-            </w:tcBorders>
-            <w:shd w:fill="EAF4EA" w:val="clear"/>
+              <w:top w:val="single" w:color="8B1A1A" w:sz="6"/>
+              <w:left w:val="single" w:color="8B1A1A" w:sz="6"/>
+              <w:bottom w:val="single" w:color="8B1A1A" w:sz="6"/>
+              <w:right w:val="single" w:color="8B1A1A" w:sz="6"/>
+            </w:tcBorders>
+            <w:shd w:fill="FDF0F0" w:val="clear"/>
             <w:tcMar>
               <w:top w:type="dxa" w:w="120"/>
               <w:left w:type="dxa" w:w="200"/>
@@ -846,12 +795,63 @@
                 <w:sz w:val="22"/>
                 <w:szCs w:val="22"/>
               </w:rPr>
-              <w:t xml:space="preserve">The revenue allocation is not discretionary. The enabling legislation must specify: (1) social programs receive first priority in revenue allocation — healthcare, guaranteed income, and universal pensions funded before any other use; (2) a reserve fund receives second priority; (3) debt paydown receives the surplus after (1) and (2) are fully funded. This ordering is not advisory. It is statutory. A bill that removes this ordering has removed the purpose of the instrument.</w:t>
+              <w:t xml:space="preserve">The financial sector lobby requests ‘temporary’ exemptions for ‘liquidity-critical’ instruments: repo markets, interbank lending, currency swaps, derivatives clearing. Each exemption has a plausible-sounding justification — systemic risk, market function, international competitiveness. Each is granted separately, in conference or rulemaking, without a floor vote on the combined effect. The cumulative result: the highest-volume speculative transactions — exactly the ones the instrument is designed to tax — are exempt. What remains is a flat excise on productive commerce. The revenue base collapses. Social programs are cut as underfunded. The instrument has been structurally inverted. Note: the justification for each carve-out is always available. There is no instrument that cannot be argued as ‘systemic.’ Uniformity is not a design preference — it is the constitutional and economic load-bearing wall. The moment one exemption exists, every sector has an equivalent argument and the wall comes down.</w:t>
             </w:r>
           </w:p>
         </w:tc>
       </w:tr>
     </w:tbl>
+    <w:p>
+      <w:pPr>
+        <w:spacing w:after="0" w:before="200"/>
+      </w:pPr>
+      <w:r>
+        <w:t xml:space="preserve"/>
+      </w:r>
+    </w:p>
+    <w:p>
+      <w:r>
+        <w:br w:type="page"/>
+      </w:r>
+    </w:p>
+    <w:p>
+      <w:pPr>
+        <w:pStyle w:val="Heading1"/>
+        <w:pBdr>
+          <w:bottom w:val="single" w:color="B8860B" w:sz="4"/>
+        </w:pBdr>
+        <w:spacing w:after="100" w:before="320"/>
+      </w:pPr>
+      <w:r>
+        <w:rPr>
+          <w:rFonts w:ascii="Arial" w:cs="Arial" w:eastAsia="Arial" w:hAnsi="Arial"/>
+          <w:b/>
+          <w:bCs/>
+          <w:color w:val="1B3A5C"/>
+          <w:sz w:val="28"/>
+          <w:szCs w:val="28"/>
+        </w:rPr>
+        <w:t xml:space="preserve">III. The Non-Negotiable Statutory Package</w:t>
+      </w:r>
+    </w:p>
+    <w:p>
+      <w:pPr>
+        <w:spacing w:after="100" w:before="60"/>
+      </w:pPr>
+      <w:r>
+        <w:rPr>
+          <w:rFonts w:ascii="Arial" w:cs="Arial" w:eastAsia="Arial" w:hAnsi="Arial"/>
+          <w:b w:val="false"/>
+          <w:bCs w:val="false"/>
+          <w:i w:val="false"/>
+          <w:iCs w:val="false"/>
+          <w:color w:val="1A1A1A"/>
+          <w:sz w:val="22"/>
+          <w:szCs w:val="22"/>
+        </w:rPr>
+        <w:t xml:space="preserve">The following five provisions must survive conference intact. Each corresponds to a specific failure mode. Losing any one of them converts the proposal from transformative to harmful.</w:t>
+      </w:r>
+    </w:p>
     <w:p>
       <w:pPr>
         <w:spacing w:after="0" w:before="120"/>
@@ -903,7 +903,7 @@
                 <w:sz w:val="20"/>
                 <w:szCs w:val="20"/>
               </w:rPr>
-              <w:t xml:space="preserve">SAFEGUARD 2: THRESHOLD FLOOR WITH SUPERMAJORITY REQUIREMENT (VS. FAILURE MODE 1)</w:t>
+              <w:t xml:space="preserve">SAFEGUARD 1: STATUTORY ALLOCATION LOCK (VS. FAILURE MODE 2)</w:t>
             </w:r>
           </w:p>
         </w:tc>
@@ -934,7 +934,7 @@
                 <w:sz w:val="22"/>
                 <w:szCs w:val="22"/>
               </w:rPr>
-              <w:t xml:space="preserve">The minimum transaction threshold below which the velocity tax does not apply is established in the enabling legislation at $10,000 for consumer transactions and $100,000 for all other transactions. Lowering this threshold requires a two-thirds supermajority vote in both chambers — not ordinary legislation. This prevents threshold creep through simple majority horse-trading. Any proposal to lower the threshold without a corresponding increase in social program funding and a new CBO distributional analysis is not fiscal reform. It is redistribution upward.</w:t>
+              <w:t xml:space="preserve">The revenue allocation is not discretionary. The enabling legislation must specify: (1) social programs receive first priority in revenue allocation — healthcare, guaranteed income, and universal pensions funded before any other use; (2) a reserve fund receives second priority; (3) debt paydown receives the surplus after (1) and (2) are fully funded. This ordering is not advisory. It is statutory. A bill that removes this ordering has removed the purpose of the instrument.</w:t>
             </w:r>
           </w:p>
         </w:tc>
@@ -991,7 +991,7 @@
                 <w:sz w:val="20"/>
                 <w:szCs w:val="20"/>
               </w:rPr>
-              <w:t xml:space="preserve">SAFEGUARD 3: FINANCIAL SECTOR EXCLUSION FROM OVERSIGHT (VS. FAILURE MODE 3)</w:t>
+              <w:t xml:space="preserve">SAFEGUARD 2: THRESHOLD FLOOR WITH SUPERMAJORITY REQUIREMENT (VS. FAILURE MODE 1)</w:t>
             </w:r>
           </w:p>
         </w:tc>
@@ -1022,7 +1022,7 @@
                 <w:sz w:val="22"/>
                 <w:szCs w:val="22"/>
               </w:rPr>
-              <w:t xml:space="preserve">The Seventh Generation Monetary Oversight Commission (Action 10 of the legislative plan) is explicitly barred from financial sector participation — not as a preference, but as a statutory disqualification. Any person employed by, compensated by, or holding significant equity in any financial institution within 7 years prior to appointment is ineligible. This provision must be in the enabling legislation, not in the Commission’s operating rules, where it can be amended by the Commission itself. Parameter setting through notice-and-comment rulemaking with financial sector exclusion is the structural prevention of capture.</w:t>
+              <w:t xml:space="preserve">The minimum transaction threshold below which the velocity tax does not apply is established in the enabling legislation at $10,000 for consumer transactions and $100,000 for all other transactions. Lowering this threshold requires a two-thirds supermajority vote in both chambers — not ordinary legislation. This prevents threshold creep through simple majority horse-trading. Any proposal to lower the threshold without a corresponding increase in social program funding and a new CBO distributional analysis is not fiscal reform. It is redistribution upward.</w:t>
             </w:r>
           </w:p>
         </w:tc>
@@ -1079,7 +1079,7 @@
                 <w:sz w:val="20"/>
                 <w:szCs w:val="20"/>
               </w:rPr>
-              <w:t xml:space="preserve">SAFEGUARD 4: RENEWAL WITH INDEPENDENT CERTIFICATION (VS. FAILURE MODE 4)</w:t>
+              <w:t xml:space="preserve">SAFEGUARD 3: FINANCIAL SECTOR EXCLUSION FROM OVERSIGHT (VS. FAILURE MODE 3)</w:t>
             </w:r>
           </w:p>
         </w:tc>
@@ -1110,7 +1110,183 @@
                 <w:sz w:val="22"/>
                 <w:szCs w:val="22"/>
               </w:rPr>
+              <w:t xml:space="preserve">The Seventh Generation Monetary Oversight Commission (Action 10 of the legislative plan) is explicitly barred from financial sector participation — not as a preference, but as a statutory disqualification. Any person employed by, compensated by, or holding significant equity in any financial institution within 7 years prior to appointment is ineligible. This provision must be in the enabling legislation, not in the Commission’s operating rules, where it can be amended by the Commission itself. Parameter setting through notice-and-comment rulemaking with financial sector exclusion is the structural prevention of capture.</w:t>
+            </w:r>
+          </w:p>
+        </w:tc>
+      </w:tr>
+    </w:tbl>
+    <w:p>
+      <w:pPr>
+        <w:spacing w:after="0" w:before="120"/>
+      </w:pPr>
+      <w:r>
+        <w:t xml:space="preserve"/>
+      </w:r>
+    </w:p>
+    <w:tbl>
+      <w:tblPr>
+        <w:tblW w:type="dxa" w:w="9720"/>
+        <w:tblBorders>
+          <w:top w:val="single" w:color="auto" w:sz="4"/>
+          <w:left w:val="single" w:color="auto" w:sz="4"/>
+          <w:bottom w:val="single" w:color="auto" w:sz="4"/>
+          <w:right w:val="single" w:color="auto" w:sz="4"/>
+          <w:insideH w:val="single" w:color="auto" w:sz="4"/>
+          <w:insideV w:val="single" w:color="auto" w:sz="4"/>
+        </w:tblBorders>
+      </w:tblPr>
+      <w:tblGrid>
+        <w:gridCol w:w="9720"/>
+      </w:tblGrid>
+      <w:tr>
+        <w:tc>
+          <w:tcPr>
+            <w:tcW w:type="dxa" w:w="9720"/>
+            <w:tcBorders>
+              <w:top w:val="single" w:color="2E6B2E" w:sz="6"/>
+              <w:left w:val="single" w:color="2E6B2E" w:sz="6"/>
+              <w:bottom w:val="single" w:color="2E6B2E" w:sz="6"/>
+              <w:right w:val="single" w:color="2E6B2E" w:sz="6"/>
+            </w:tcBorders>
+            <w:shd w:fill="2E6B2E" w:val="clear"/>
+            <w:tcMar>
+              <w:top w:type="dxa" w:w="60"/>
+              <w:left w:type="dxa" w:w="160"/>
+              <w:bottom w:type="dxa" w:w="60"/>
+              <w:right w:type="dxa" w:w="160"/>
+            </w:tcMar>
+          </w:tcPr>
+          <w:p>
+            <w:r>
+              <w:rPr>
+                <w:rFonts w:ascii="Arial" w:cs="Arial" w:eastAsia="Arial" w:hAnsi="Arial"/>
+                <w:b/>
+                <w:bCs/>
+                <w:color w:val="FFFFFF"/>
+                <w:sz w:val="20"/>
+                <w:szCs w:val="20"/>
+              </w:rPr>
+              <w:t xml:space="preserve">SAFEGUARD 4: RENEWAL WITH INDEPENDENT CERTIFICATION (VS. FAILURE MODE 4)</w:t>
+            </w:r>
+          </w:p>
+        </w:tc>
+      </w:tr>
+      <w:tr>
+        <w:tc>
+          <w:tcPr>
+            <w:tcW w:type="dxa" w:w="9720"/>
+            <w:tcBorders>
+              <w:top w:val="single" w:color="2E6B2E" w:sz="6"/>
+              <w:left w:val="single" w:color="2E6B2E" w:sz="6"/>
+              <w:bottom w:val="single" w:color="2E6B2E" w:sz="6"/>
+              <w:right w:val="single" w:color="2E6B2E" w:sz="6"/>
+            </w:tcBorders>
+            <w:shd w:fill="EAF4EA" w:val="clear"/>
+            <w:tcMar>
+              <w:top w:type="dxa" w:w="120"/>
+              <w:left w:type="dxa" w:w="200"/>
+              <w:bottom w:type="dxa" w:w="120"/>
+              <w:right w:type="dxa" w:w="200"/>
+            </w:tcMar>
+          </w:tcPr>
+          <w:p>
+            <w:r>
+              <w:rPr>
+                <w:rFonts w:ascii="Arial" w:cs="Arial" w:eastAsia="Arial" w:hAnsi="Arial"/>
+                <w:color w:val="1A1A1A"/>
+                <w:sz w:val="22"/>
+                <w:szCs w:val="22"/>
+              </w:rPr>
               <w:t xml:space="preserve">The 36-month pilot renews only upon affirmative vote, with two required conditions: (1) an independent certification — by an entity that is not Treasury, not the Fed, and not CBO — that the social program allocations were fully funded and actually deployed during the pilot; and (2) a distributional impact analysis showing that the net effect on households below the median income is positive. If either condition is not met, the sunset triggers automatically and cannot be waived by executive action. This makes the social dividend inseparable from the instrument’s continuation.</w:t>
+            </w:r>
+          </w:p>
+        </w:tc>
+      </w:tr>
+    </w:tbl>
+    <w:p>
+      <w:pPr>
+        <w:spacing w:after="0" w:before="120"/>
+      </w:pPr>
+      <w:r>
+        <w:t xml:space="preserve"/>
+      </w:r>
+    </w:p>
+    <w:tbl>
+      <w:tblPr>
+        <w:tblW w:type="dxa" w:w="9720"/>
+        <w:tblBorders>
+          <w:top w:val="single" w:color="auto" w:sz="4"/>
+          <w:left w:val="single" w:color="auto" w:sz="4"/>
+          <w:bottom w:val="single" w:color="auto" w:sz="4"/>
+          <w:right w:val="single" w:color="auto" w:sz="4"/>
+          <w:insideH w:val="single" w:color="auto" w:sz="4"/>
+          <w:insideV w:val="single" w:color="auto" w:sz="4"/>
+        </w:tblBorders>
+      </w:tblPr>
+      <w:tblGrid>
+        <w:gridCol w:w="9720"/>
+      </w:tblGrid>
+      <w:tr>
+        <w:tc>
+          <w:tcPr>
+            <w:tcW w:type="dxa" w:w="9720"/>
+            <w:tcBorders>
+              <w:top w:val="single" w:color="2E6B2E" w:sz="6"/>
+              <w:left w:val="single" w:color="2E6B2E" w:sz="6"/>
+              <w:bottom w:val="single" w:color="2E6B2E" w:sz="6"/>
+              <w:right w:val="single" w:color="2E6B2E" w:sz="6"/>
+            </w:tcBorders>
+            <w:shd w:fill="2E6B2E" w:val="clear"/>
+            <w:tcMar>
+              <w:top w:type="dxa" w:w="60"/>
+              <w:left w:type="dxa" w:w="160"/>
+              <w:bottom w:type="dxa" w:w="60"/>
+              <w:right w:type="dxa" w:w="160"/>
+            </w:tcMar>
+          </w:tcPr>
+          <w:p>
+            <w:r>
+              <w:rPr>
+                <w:rFonts w:ascii="Arial" w:cs="Arial" w:eastAsia="Arial" w:hAnsi="Arial"/>
+                <w:b/>
+                <w:bCs/>
+                <w:color w:val="FFFFFF"/>
+                <w:sz w:val="20"/>
+                <w:szCs w:val="20"/>
+              </w:rPr>
+              <w:t xml:space="preserve">SAFEGUARD 5: STATUTORY PROHIBITION ON INSTRUMENT-SPECIFIC EXEMPTIONS (VS. FAILURE MODE 5)</w:t>
+            </w:r>
+          </w:p>
+        </w:tc>
+      </w:tr>
+      <w:tr>
+        <w:tc>
+          <w:tcPr>
+            <w:tcW w:type="dxa" w:w="9720"/>
+            <w:tcBorders>
+              <w:top w:val="single" w:color="2E6B2E" w:sz="6"/>
+              <w:left w:val="single" w:color="2E6B2E" w:sz="6"/>
+              <w:bottom w:val="single" w:color="2E6B2E" w:sz="6"/>
+              <w:right w:val="single" w:color="2E6B2E" w:sz="6"/>
+            </w:tcBorders>
+            <w:shd w:fill="EAF4EA" w:val="clear"/>
+            <w:tcMar>
+              <w:top w:type="dxa" w:w="120"/>
+              <w:left w:type="dxa" w:w="200"/>
+              <w:bottom w:type="dxa" w:w="120"/>
+              <w:right w:type="dxa" w:w="200"/>
+            </w:tcMar>
+          </w:tcPr>
+          <w:p>
+            <w:r>
+              <w:rPr>
+                <w:rFonts w:ascii="Arial" w:cs="Arial" w:eastAsia="Arial" w:hAnsi="Arial"/>
+                <w:color w:val="1A1A1A"/>
+                <w:sz w:val="22"/>
+                <w:szCs w:val="22"/>
+              </w:rPr>
+              <w:t xml:space="preserve">The enabling legislation must include an explicit prohibition: no transaction type, financial instrument, market sector, or counterparty class is exempt from the velocity tax rate. Any exemption — permanent, temporary, or conditional — requires the same two-thirds supermajority in both chambers as the threshold floor (Safeguard 2), plus a mandatory CBO analysis showing the distributional impact of the exemption on households below median income, published in full before the vote. ‘Systemic liquidity risk’ is not a statutory basis for exemption — it is the argument every exemption request will make. If the argument were sufficient, the circuit breaker mechanism (Mode 3) is the correct response: a universal rate ceiling applied to all transactions equally, not a carve-out for preferred instruments. Allied legislators must treat any exemption request as a structural attack on the instrument, regardless of the justification offered.</w:t>
             </w:r>
           </w:p>
         </w:tc>

</xml_diff>

<commit_message>
Explicit rebate participation and no-carve-out government parity across all three docs
Conditional rebate: HFT firms and hedge funds explicitly eligible on same
terms as banks — full rate paid, rebate returned only via designated account
with criminal liability for misuse. Not a rate carve-out.

No-carve-out parity: government transactions subject to same rate as
everyone else. Public framing: explain why you deserve a privilege the
US government itself does not have. Added to public brief, allied memo
Red Lines table, and dollar stability brief.

Co-Authored-By: Claude Sonnet 4.6 <noreply@anthropic.com>
</commit_message>
<xml_diff>
--- a/reports/allied_memo_2026-04-05.docx
+++ b/reports/allied_memo_2026-04-05.docx
@@ -1799,6 +1799,130 @@
                 <w:szCs w:val="20"/>
               </w:rPr>
               <w:t xml:space="preserve">The velocity tax is self-collecting at the clearing layer. There is no returns-based enforcement function. Retaining IRS enforcement infrastructure for the velocity tax is the mechanism through which audit-based avoidance strategies are later permitted. The transformation of the IRS from enforcement to economic development must be concurrent with implementation, not deferred.</w:t>
+            </w:r>
+          </w:p>
+        </w:tc>
+      </w:tr>
+      <w:tr>
+        <w:tc>
+          <w:tcPr>
+            <w:tcW w:type="dxa" w:w="3480"/>
+            <w:tcBorders>
+              <w:top w:val="single" w:color="CCCCCC" w:sz="6"/>
+              <w:left w:val="single" w:color="CCCCCC" w:sz="6"/>
+              <w:bottom w:val="single" w:color="CCCCCC" w:sz="6"/>
+              <w:right w:val="single" w:color="CCCCCC" w:sz="6"/>
+            </w:tcBorders>
+            <w:shd w:fill="FDF0F0" w:val="clear"/>
+            <w:tcMar>
+              <w:top w:type="dxa" w:w="80"/>
+              <w:left w:type="dxa" w:w="120"/>
+              <w:bottom w:type="dxa" w:w="80"/>
+              <w:right w:type="dxa" w:w="120"/>
+            </w:tcMar>
+          </w:tcPr>
+          <w:p>
+            <w:r>
+              <w:rPr>
+                <w:rFonts w:ascii="Arial" w:cs="Arial" w:eastAsia="Arial" w:hAnsi="Arial"/>
+                <w:b/>
+                <w:bCs/>
+                <w:color w:val="8B1A1A"/>
+                <w:sz w:val="20"/>
+                <w:szCs w:val="20"/>
+              </w:rPr>
+              <w:t xml:space="preserve">Financial sector carve-out requests of any kind</w:t>
+            </w:r>
+          </w:p>
+        </w:tc>
+        <w:tc>
+          <w:tcPr>
+            <w:tcW w:type="dxa" w:w="6240"/>
+            <w:tcBorders>
+              <w:top w:val="single" w:color="CCCCCC" w:sz="6"/>
+              <w:left w:val="single" w:color="CCCCCC" w:sz="6"/>
+              <w:bottom w:val="single" w:color="CCCCCC" w:sz="6"/>
+              <w:right w:val="single" w:color="CCCCCC" w:sz="6"/>
+            </w:tcBorders>
+            <w:shd w:fill="FFFFFF" w:val="clear"/>
+            <w:tcMar>
+              <w:top w:type="dxa" w:w="80"/>
+              <w:left w:type="dxa" w:w="120"/>
+              <w:bottom w:type="dxa" w:w="80"/>
+              <w:right w:type="dxa" w:w="120"/>
+            </w:tcMar>
+          </w:tcPr>
+          <w:p>
+            <w:r>
+              <w:rPr>
+                <w:rFonts w:ascii="Arial" w:cs="Arial" w:eastAsia="Arial" w:hAnsi="Arial"/>
+                <w:color w:val="1A1A1A"/>
+                <w:sz w:val="20"/>
+                <w:szCs w:val="20"/>
+              </w:rPr>
+              <w:t xml:space="preserve">The political answer is simple and must be stated publicly: the federal government’s own transactions are subject to this rate. State and local government transactions are subject to this rate. No public entity — Congress, the Pentagon, the Treasury — receives an exemption. When the financial sector requests a carve-out, the answer on the floor is: explain why you deserve a privilege that the United States government itself does not receive. This framing makes a carve-out vote politically toxic. Use it.</w:t>
+            </w:r>
+          </w:p>
+        </w:tc>
+      </w:tr>
+      <w:tr>
+        <w:tc>
+          <w:tcPr>
+            <w:tcW w:type="dxa" w:w="3480"/>
+            <w:tcBorders>
+              <w:top w:val="single" w:color="CCCCCC" w:sz="6"/>
+              <w:left w:val="single" w:color="CCCCCC" w:sz="6"/>
+              <w:bottom w:val="single" w:color="CCCCCC" w:sz="6"/>
+              <w:right w:val="single" w:color="CCCCCC" w:sz="6"/>
+            </w:tcBorders>
+            <w:shd w:fill="FDF0F0" w:val="clear"/>
+            <w:tcMar>
+              <w:top w:type="dxa" w:w="80"/>
+              <w:left w:type="dxa" w:w="120"/>
+              <w:bottom w:type="dxa" w:w="80"/>
+              <w:right w:type="dxa" w:w="120"/>
+            </w:tcMar>
+          </w:tcPr>
+          <w:p>
+            <w:r>
+              <w:rPr>
+                <w:rFonts w:ascii="Arial" w:cs="Arial" w:eastAsia="Arial" w:hAnsi="Arial"/>
+                <w:b/>
+                <w:bCs/>
+                <w:color w:val="8B1A1A"/>
+                <w:sz w:val="20"/>
+                <w:szCs w:val="20"/>
+              </w:rPr>
+              <w:t xml:space="preserve">‘Rebate instead of rate reduction’ as carve-out substitute</w:t>
+            </w:r>
+          </w:p>
+        </w:tc>
+        <w:tc>
+          <w:tcPr>
+            <w:tcW w:type="dxa" w:w="6240"/>
+            <w:tcBorders>
+              <w:top w:val="single" w:color="CCCCCC" w:sz="6"/>
+              <w:left w:val="single" w:color="CCCCCC" w:sz="6"/>
+              <w:bottom w:val="single" w:color="CCCCCC" w:sz="6"/>
+              <w:right w:val="single" w:color="CCCCCC" w:sz="6"/>
+            </w:tcBorders>
+            <w:shd w:fill="FFFFFF" w:val="clear"/>
+            <w:tcMar>
+              <w:top w:type="dxa" w:w="80"/>
+              <w:left w:type="dxa" w:w="120"/>
+              <w:bottom w:type="dxa" w:w="80"/>
+              <w:right w:type="dxa" w:w="120"/>
+            </w:tcMar>
+          </w:tcPr>
+          <w:p>
+            <w:r>
+              <w:rPr>
+                <w:rFonts w:ascii="Arial" w:cs="Arial" w:eastAsia="Arial" w:hAnsi="Arial"/>
+                <w:color w:val="1A1A1A"/>
+                <w:sz w:val="20"/>
+                <w:szCs w:val="20"/>
+              </w:rPr>
+              <w:t xml:space="preserve">The conditional rebate IS available to high-frequency trading firms, hedge funds, and private equity — on exactly the same terms as any other financial institution. They pay the full rate. They get 5–10% back if they deploy into qualifying productive investment through a designated separate account with independent certification and criminal liability for misuse. This is not a carve-out. It is a productive investment incentive open to any entity willing to put capital to work in the real economy. If a financial institution asks for a rebate without the productive investment condition, that is a carve-out. Reject it.</w:t>
             </w:r>
           </w:p>
         </w:tc>

</xml_diff>